<commit_message>
feat: implement comprehensive homeroom teacher management system including API routes for dashboard, schedules, and grade reports.
</commit_message>
<xml_diff>
--- a/Dokumentasi_Akun_Pengguna_v2.docx
+++ b/Dokumentasi_Akun_Pengguna_v2.docx
@@ -138,27 +138,27 @@
           </w:tcPr>
           <w:p>
             <w:r>
-              <w:t>Budi Santoso</w:t>
-            </w:r>
-          </w:p>
-        </w:tc>
-        <w:tc>
-          <w:tcPr>
-            <w:tcW w:type="dxa" w:w="1728"/>
-          </w:tcPr>
-          <w:p>
-            <w:r>
-              <w:t>-</w:t>
-            </w:r>
-          </w:p>
-        </w:tc>
-        <w:tc>
-          <w:tcPr>
-            <w:tcW w:type="dxa" w:w="1728"/>
-          </w:tcPr>
-          <w:p>
-            <w:r>
-              <w:t>wali@school.edu</w:t>
+              <w:t>H. Wawan Herniwan, M.Pd</w:t>
+            </w:r>
+          </w:p>
+        </w:tc>
+        <w:tc>
+          <w:tcPr>
+            <w:tcW w:type="dxa" w:w="1728"/>
+          </w:tcPr>
+          <w:p>
+            <w:r>
+              <w:t>IX A</w:t>
+            </w:r>
+          </w:p>
+        </w:tc>
+        <w:tc>
+          <w:tcPr>
+            <w:tcW w:type="dxa" w:w="1728"/>
+          </w:tcPr>
+          <w:p>
+            <w:r>
+              <w:t>hwawanhern29@guru.educore.id</w:t>
             </w:r>
           </w:p>
         </w:tc>
@@ -190,27 +190,27 @@
           </w:tcPr>
           <w:p>
             <w:r>
-              <w:t>H. Wawan Herniwan, M.Pd</w:t>
-            </w:r>
-          </w:p>
-        </w:tc>
-        <w:tc>
-          <w:tcPr>
-            <w:tcW w:type="dxa" w:w="1728"/>
-          </w:tcPr>
-          <w:p>
-            <w:r>
-              <w:t>IX A</w:t>
-            </w:r>
-          </w:p>
-        </w:tc>
-        <w:tc>
-          <w:tcPr>
-            <w:tcW w:type="dxa" w:w="1728"/>
-          </w:tcPr>
-          <w:p>
-            <w:r>
-              <w:t>hwawanhern22@guru.educore.id</w:t>
+              <w:t>Atie Novita Zahroh, S.Pd</w:t>
+            </w:r>
+          </w:p>
+        </w:tc>
+        <w:tc>
+          <w:tcPr>
+            <w:tcW w:type="dxa" w:w="1728"/>
+          </w:tcPr>
+          <w:p>
+            <w:r>
+              <w:t>IX B</w:t>
+            </w:r>
+          </w:p>
+        </w:tc>
+        <w:tc>
+          <w:tcPr>
+            <w:tcW w:type="dxa" w:w="1728"/>
+          </w:tcPr>
+          <w:p>
+            <w:r>
+              <w:t>atienovita30@guru.educore.id</w:t>
             </w:r>
           </w:p>
         </w:tc>
@@ -242,27 +242,27 @@
           </w:tcPr>
           <w:p>
             <w:r>
-              <w:t>Atie Novita Zahroh, S.Pd</w:t>
-            </w:r>
-          </w:p>
-        </w:tc>
-        <w:tc>
-          <w:tcPr>
-            <w:tcW w:type="dxa" w:w="1728"/>
-          </w:tcPr>
-          <w:p>
-            <w:r>
-              <w:t>IX B</w:t>
-            </w:r>
-          </w:p>
-        </w:tc>
-        <w:tc>
-          <w:tcPr>
-            <w:tcW w:type="dxa" w:w="1728"/>
-          </w:tcPr>
-          <w:p>
-            <w:r>
-              <w:t>atienovita23@guru.educore.id</w:t>
+              <w:t>Fanny Fadilla, S.Sos</w:t>
+            </w:r>
+          </w:p>
+        </w:tc>
+        <w:tc>
+          <w:tcPr>
+            <w:tcW w:type="dxa" w:w="1728"/>
+          </w:tcPr>
+          <w:p>
+            <w:r>
+              <w:t>VII A</w:t>
+            </w:r>
+          </w:p>
+        </w:tc>
+        <w:tc>
+          <w:tcPr>
+            <w:tcW w:type="dxa" w:w="1728"/>
+          </w:tcPr>
+          <w:p>
+            <w:r>
+              <w:t>fannyfadil31@guru.educore.id</w:t>
             </w:r>
           </w:p>
         </w:tc>
@@ -294,27 +294,27 @@
           </w:tcPr>
           <w:p>
             <w:r>
-              <w:t>Fanny Fadilla, S.Sos</w:t>
-            </w:r>
-          </w:p>
-        </w:tc>
-        <w:tc>
-          <w:tcPr>
-            <w:tcW w:type="dxa" w:w="1728"/>
-          </w:tcPr>
-          <w:p>
-            <w:r>
-              <w:t>VII A</w:t>
-            </w:r>
-          </w:p>
-        </w:tc>
-        <w:tc>
-          <w:tcPr>
-            <w:tcW w:type="dxa" w:w="1728"/>
-          </w:tcPr>
-          <w:p>
-            <w:r>
-              <w:t>fannyfadil24@guru.educore.id</w:t>
+              <w:t>Siti Halimah, S.Pd</w:t>
+            </w:r>
+          </w:p>
+        </w:tc>
+        <w:tc>
+          <w:tcPr>
+            <w:tcW w:type="dxa" w:w="1728"/>
+          </w:tcPr>
+          <w:p>
+            <w:r>
+              <w:t>VII B</w:t>
+            </w:r>
+          </w:p>
+        </w:tc>
+        <w:tc>
+          <w:tcPr>
+            <w:tcW w:type="dxa" w:w="1728"/>
+          </w:tcPr>
+          <w:p>
+            <w:r>
+              <w:t>sitihalima32@guru.educore.id</w:t>
             </w:r>
           </w:p>
         </w:tc>
@@ -346,27 +346,27 @@
           </w:tcPr>
           <w:p>
             <w:r>
-              <w:t>Siti Halimah, S.Pd</w:t>
-            </w:r>
-          </w:p>
-        </w:tc>
-        <w:tc>
-          <w:tcPr>
-            <w:tcW w:type="dxa" w:w="1728"/>
-          </w:tcPr>
-          <w:p>
-            <w:r>
-              <w:t>VII B</w:t>
-            </w:r>
-          </w:p>
-        </w:tc>
-        <w:tc>
-          <w:tcPr>
-            <w:tcW w:type="dxa" w:w="1728"/>
-          </w:tcPr>
-          <w:p>
-            <w:r>
-              <w:t>sitihalima25@guru.educore.id</w:t>
+              <w:t>Icah, S.Pd</w:t>
+            </w:r>
+          </w:p>
+        </w:tc>
+        <w:tc>
+          <w:tcPr>
+            <w:tcW w:type="dxa" w:w="1728"/>
+          </w:tcPr>
+          <w:p>
+            <w:r>
+              <w:t>VIII A</w:t>
+            </w:r>
+          </w:p>
+        </w:tc>
+        <w:tc>
+          <w:tcPr>
+            <w:tcW w:type="dxa" w:w="1728"/>
+          </w:tcPr>
+          <w:p>
+            <w:r>
+              <w:t>icahspd27@guru.educore.id</w:t>
             </w:r>
           </w:p>
         </w:tc>
@@ -398,58 +398,6 @@
           </w:tcPr>
           <w:p>
             <w:r>
-              <w:t>Icah, S.Pd</w:t>
-            </w:r>
-          </w:p>
-        </w:tc>
-        <w:tc>
-          <w:tcPr>
-            <w:tcW w:type="dxa" w:w="1728"/>
-          </w:tcPr>
-          <w:p>
-            <w:r>
-              <w:t>VIII A</w:t>
-            </w:r>
-          </w:p>
-        </w:tc>
-        <w:tc>
-          <w:tcPr>
-            <w:tcW w:type="dxa" w:w="1728"/>
-          </w:tcPr>
-          <w:p>
-            <w:r>
-              <w:t>icahspd20@guru.educore.id</w:t>
-            </w:r>
-          </w:p>
-        </w:tc>
-        <w:tc>
-          <w:tcPr>
-            <w:tcW w:type="dxa" w:w="1728"/>
-          </w:tcPr>
-          <w:p>
-            <w:r>
-              <w:t>password</w:t>
-            </w:r>
-          </w:p>
-        </w:tc>
-      </w:tr>
-      <w:tr>
-        <w:tc>
-          <w:tcPr>
-            <w:tcW w:type="dxa" w:w="1728"/>
-          </w:tcPr>
-          <w:p>
-            <w:r>
-              <w:t>7</w:t>
-            </w:r>
-          </w:p>
-        </w:tc>
-        <w:tc>
-          <w:tcPr>
-            <w:tcW w:type="dxa" w:w="1728"/>
-          </w:tcPr>
-          <w:p>
-            <w:r>
               <w:t>Cahya Risyana, S.Pd</w:t>
             </w:r>
           </w:p>
@@ -470,7 +418,7 @@
           </w:tcPr>
           <w:p>
             <w:r>
-              <w:t>cahyarisya21@guru.educore.id</w:t>
+              <w:t>cahyarisya28@guru.educore.id</w:t>
             </w:r>
           </w:p>
         </w:tc>
@@ -591,7 +539,7 @@
           </w:tcPr>
           <w:p>
             <w:r>
-              <w:t>Abdurrahman Wahid</w:t>
+              <w:t>Ibu Kartika (IPA)</w:t>
             </w:r>
           </w:p>
         </w:tc>
@@ -611,7 +559,7 @@
           </w:tcPr>
           <w:p>
             <w:r>
-              <w:t>guru_agama@school.edu</w:t>
+              <w:t>guru.mapel104@guru.educore.id</w:t>
             </w:r>
           </w:p>
         </w:tc>
@@ -643,7 +591,7 @@
           </w:tcPr>
           <w:p>
             <w:r>
-              <w:t>Affandi Koesoema</w:t>
+              <w:t>Ibu Ningsih (B.Indo)</w:t>
             </w:r>
           </w:p>
         </w:tc>
@@ -663,7 +611,7 @@
           </w:tcPr>
           <w:p>
             <w:r>
-              <w:t>guru_seni@school.edu</w:t>
+              <w:t>guru.mapel102@guru.educore.id</w:t>
             </w:r>
           </w:p>
         </w:tc>
@@ -695,7 +643,7 @@
           </w:tcPr>
           <w:p>
             <w:r>
-              <w:t>Albert Einstein</w:t>
+              <w:t>Mr. John (B.Inggris)</w:t>
             </w:r>
           </w:p>
         </w:tc>
@@ -715,7 +663,7 @@
           </w:tcPr>
           <w:p>
             <w:r>
-              <w:t>guru_ipa@school.edu</w:t>
+              <w:t>guru.mapel103@guru.educore.id</w:t>
             </w:r>
           </w:p>
         </w:tc>
@@ -747,7 +695,7 @@
           </w:tcPr>
           <w:p>
             <w:r>
-              <w:t>Budi Sudarsono</w:t>
+              <w:t>Pak Anwar (Matematika)</w:t>
             </w:r>
           </w:p>
         </w:tc>
@@ -767,7 +715,7 @@
           </w:tcPr>
           <w:p>
             <w:r>
-              <w:t>guru_pjok@school.edu</w:t>
+              <w:t>guru.mapel101@guru.educore.id</w:t>
             </w:r>
           </w:p>
         </w:tc>
@@ -799,7 +747,7 @@
           </w:tcPr>
           <w:p>
             <w:r>
-              <w:t>Dewi Sartika</w:t>
+              <w:t>Pak Budi (IPS)</w:t>
             </w:r>
           </w:p>
         </w:tc>
@@ -819,7 +767,7 @@
           </w:tcPr>
           <w:p>
             <w:r>
-              <w:t>guru_indonesia@school.edu</w:t>
+              <w:t>guru.mapel105@guru.educore.id</w:t>
             </w:r>
           </w:p>
         </w:tc>
@@ -851,7 +799,7 @@
           </w:tcPr>
           <w:p>
             <w:r>
-              <w:t>Ki Hajar Dewantara</w:t>
+              <w:t>Pak Susilo (PPKn)</w:t>
             </w:r>
           </w:p>
         </w:tc>
@@ -871,7 +819,7 @@
           </w:tcPr>
           <w:p>
             <w:r>
-              <w:t>guru_ppkn@school.edu</w:t>
+              <w:t>guru.mapel106@guru.educore.id</w:t>
             </w:r>
           </w:p>
         </w:tc>
@@ -903,7 +851,7 @@
           </w:tcPr>
           <w:p>
             <w:r>
-              <w:t>Mohammad Hatta</w:t>
+              <w:t>Ustadz Ahmad (PAI)</w:t>
             </w:r>
           </w:p>
         </w:tc>
@@ -923,111 +871,7 @@
           </w:tcPr>
           <w:p>
             <w:r>
-              <w:t>guru_ips@school.edu</w:t>
-            </w:r>
-          </w:p>
-        </w:tc>
-        <w:tc>
-          <w:tcPr>
-            <w:tcW w:type="dxa" w:w="1728"/>
-          </w:tcPr>
-          <w:p>
-            <w:r>
-              <w:t>password</w:t>
-            </w:r>
-          </w:p>
-        </w:tc>
-      </w:tr>
-      <w:tr>
-        <w:tc>
-          <w:tcPr>
-            <w:tcW w:type="dxa" w:w="1728"/>
-          </w:tcPr>
-          <w:p>
-            <w:r>
-              <w:t>8</w:t>
-            </w:r>
-          </w:p>
-        </w:tc>
-        <w:tc>
-          <w:tcPr>
-            <w:tcW w:type="dxa" w:w="1728"/>
-          </w:tcPr>
-          <w:p>
-            <w:r>
-              <w:t>Onno W. Purbo</w:t>
-            </w:r>
-          </w:p>
-        </w:tc>
-        <w:tc>
-          <w:tcPr>
-            <w:tcW w:type="dxa" w:w="1728"/>
-          </w:tcPr>
-          <w:p>
-            <w:r>
-              <w:t>-</w:t>
-            </w:r>
-          </w:p>
-        </w:tc>
-        <w:tc>
-          <w:tcPr>
-            <w:tcW w:type="dxa" w:w="1728"/>
-          </w:tcPr>
-          <w:p>
-            <w:r>
-              <w:t>guru_info@school.edu</w:t>
-            </w:r>
-          </w:p>
-        </w:tc>
-        <w:tc>
-          <w:tcPr>
-            <w:tcW w:type="dxa" w:w="1728"/>
-          </w:tcPr>
-          <w:p>
-            <w:r>
-              <w:t>password</w:t>
-            </w:r>
-          </w:p>
-        </w:tc>
-      </w:tr>
-      <w:tr>
-        <w:tc>
-          <w:tcPr>
-            <w:tcW w:type="dxa" w:w="1728"/>
-          </w:tcPr>
-          <w:p>
-            <w:r>
-              <w:t>9</w:t>
-            </w:r>
-          </w:p>
-        </w:tc>
-        <w:tc>
-          <w:tcPr>
-            <w:tcW w:type="dxa" w:w="1728"/>
-          </w:tcPr>
-          <w:p>
-            <w:r>
-              <w:t>Siti Rahma</w:t>
-            </w:r>
-          </w:p>
-        </w:tc>
-        <w:tc>
-          <w:tcPr>
-            <w:tcW w:type="dxa" w:w="1728"/>
-          </w:tcPr>
-          <w:p>
-            <w:r>
-              <w:t>-</w:t>
-            </w:r>
-          </w:p>
-        </w:tc>
-        <w:tc>
-          <w:tcPr>
-            <w:tcW w:type="dxa" w:w="1728"/>
-          </w:tcPr>
-          <w:p>
-            <w:r>
-              <w:t>guru@school.edu</w:t>
+              <w:t>guru.mapel107@guru.educore.id</w:t>
             </w:r>
           </w:p>
         </w:tc>
@@ -11569,58 +11413,6 @@
           <w:p>
             <w:r>
               <w:t>0117141745@siswa.educore.id</w:t>
-            </w:r>
-          </w:p>
-        </w:tc>
-        <w:tc>
-          <w:tcPr>
-            <w:tcW w:type="dxa" w:w="1728"/>
-          </w:tcPr>
-          <w:p>
-            <w:r>
-              <w:t>password</w:t>
-            </w:r>
-          </w:p>
-        </w:tc>
-      </w:tr>
-      <w:tr>
-        <w:tc>
-          <w:tcPr>
-            <w:tcW w:type="dxa" w:w="1728"/>
-          </w:tcPr>
-          <w:p>
-            <w:r>
-              <w:t>202</w:t>
-            </w:r>
-          </w:p>
-        </w:tc>
-        <w:tc>
-          <w:tcPr>
-            <w:tcW w:type="dxa" w:w="1728"/>
-          </w:tcPr>
-          <w:p>
-            <w:r>
-              <w:t>Julianne Davis</w:t>
-            </w:r>
-          </w:p>
-        </w:tc>
-        <w:tc>
-          <w:tcPr>
-            <w:tcW w:type="dxa" w:w="1728"/>
-          </w:tcPr>
-          <w:p>
-            <w:r>
-              <w:t>X-IPA-1</w:t>
-            </w:r>
-          </w:p>
-        </w:tc>
-        <w:tc>
-          <w:tcPr>
-            <w:tcW w:type="dxa" w:w="1728"/>
-          </w:tcPr>
-          <w:p>
-            <w:r>
-              <w:t>siswa@school.edu</w:t>
             </w:r>
           </w:p>
         </w:tc>

</xml_diff>